<commit_message>
docs: adicionar relatório inicial e backlog priorizado da semana 3
- auditar a linha de base de acessibilidade nas nove telas e seis fluxos críticos
- priorizar 14 achados e duas validações técnicas com critérios de aceite
- preencher a Semana 3 na planilha de acessibilidade e tecnologias assistivas
- remover do cronograma as referências a validação e revisão com orientador
</commit_message>
<xml_diff>
--- a/docs/academico/Cronograma de Acessibilidade e Tecnologias Assistivas.docx
+++ b/docs/academico/Cronograma de Acessibilidade e Tecnologias Assistivas.docx
@@ -1688,7 +1688,7 @@
                 <w:color w:val="20262B"/>
                 <w:sz w:val="17"/>
               </w:rPr>
-              <w:t>Auditar a linha de base e validar com o orientador o escopo, os critérios e o backlog priorizado de acessibilidade.</w:t>
+              <w:t>Auditar a linha de base e consolidar o escopo, os critérios e o backlog priorizado de acessibilidade.</w:t>
             </w:r>
           </w:p>
         </w:tc>
@@ -1716,7 +1716,7 @@
                 <w:color w:val="20262B"/>
                 <w:sz w:val="17"/>
               </w:rPr>
-              <w:t>Relatório inicial, backlog e registro de orientação.</w:t>
+              <w:t>Relatório inicial e backlog priorizado.</w:t>
             </w:r>
           </w:p>
         </w:tc>
@@ -2518,7 +2518,7 @@
                 <w:color w:val="20262B"/>
                 <w:sz w:val="17"/>
               </w:rPr>
-              <w:t>Revisar prioridades com o orientador e implementar fundações globais: landmarks, link para conteúdo, foco visível, contraste e preferência de movimento.</w:t>
+              <w:t>Revisar o backlog priorizado e implementar fundações globais: landmarks, link para conteúdo, foco visível, contraste e preferência de movimento.</w:t>
             </w:r>
           </w:p>
         </w:tc>
@@ -2546,7 +2546,7 @@
                 <w:color w:val="20262B"/>
                 <w:sz w:val="17"/>
               </w:rPr>
-              <w:t>Registro de orientação, commits e comparativo visual.</w:t>
+              <w:t>Commits, checklist de implementação e comparativo visual.</w:t>
             </w:r>
           </w:p>
         </w:tc>
@@ -3533,7 +3533,7 @@
                 <w:color w:val="20262B"/>
                 <w:sz w:val="17"/>
               </w:rPr>
-              <w:t>Revisar resultados com o orientador; concluir relatório, organizar evidências, conferir as horas realizadas e preparar a entrega final.</w:t>
+              <w:t>Revisar os resultados da intervenção; concluir relatório, organizar evidências, conferir as horas realizadas e preparar a entrega final.</w:t>
             </w:r>
           </w:p>
         </w:tc>
@@ -3561,7 +3561,7 @@
                 <w:color w:val="20262B"/>
                 <w:sz w:val="17"/>
               </w:rPr>
-              <w:t>Registro da revisão, relatório final e pacote de evidências.</w:t>
+              <w:t>Relatório final, checklist de revisão e pacote de evidências.</w:t>
             </w:r>
           </w:p>
         </w:tc>
@@ -4394,7 +4394,7 @@
           <w:color w:val="20262B"/>
           <w:sz w:val="20"/>
         </w:rPr>
-        <w:t>Registros de orientação, apresentação ao clube e feedback recebido.</w:t>
+        <w:t>Registro da apresentação ao clube e feedback recebido.</w:t>
       </w:r>
     </w:p>
     <w:p>

</xml_diff>